<commit_message>
docs: add assignment report documentation in PDF and Word formats
</commit_message>
<xml_diff>
--- a/CS341_A1_Starter/CS341_A1_Report_Group5.docx
+++ b/CS341_A1_Starter/CS341_A1_Report_Group5.docx
@@ -507,7 +507,7 @@
             </w:rPr>
             <w:fldChar w:fldCharType="separate"/>
           </w:r>
-          <w:hyperlink w:anchor="_Toc239974219" w:history="1">
+          <w:hyperlink w:anchor="_Toc239977191" w:history="1">
             <w:r>
               <w:rPr>
                 <w:rStyle w:val="Hyperlink"/>
@@ -535,7 +535,7 @@
                 <w:noProof/>
                 <w:webHidden/>
               </w:rPr>
-              <w:instrText xml:space="preserve"> PAGEREF _Toc239974219 \h </w:instrText>
+              <w:instrText xml:space="preserve"> PAGEREF _Toc239977191 \h </w:instrText>
             </w:r>
             <w:r>
               <w:rPr>
@@ -579,7 +579,7 @@
               <w:szCs w:val="24"/>
             </w:rPr>
           </w:pPr>
-          <w:hyperlink w:anchor="_Toc239974220" w:history="1">
+          <w:hyperlink w:anchor="_Toc239977192" w:history="1">
             <w:r>
               <w:rPr>
                 <w:rStyle w:val="Hyperlink"/>
@@ -609,7 +609,7 @@
                 <w:noProof/>
                 <w:webHidden/>
               </w:rPr>
-              <w:instrText xml:space="preserve"> PAGEREF _Toc239974220 \h </w:instrText>
+              <w:instrText xml:space="preserve"> PAGEREF _Toc239977192 \h </w:instrText>
             </w:r>
             <w:r>
               <w:rPr>
@@ -653,7 +653,7 @@
               <w:szCs w:val="24"/>
             </w:rPr>
           </w:pPr>
-          <w:hyperlink w:anchor="_Toc239974221" w:history="1">
+          <w:hyperlink w:anchor="_Toc239977193" w:history="1">
             <w:r>
               <w:rPr>
                 <w:rStyle w:val="Hyperlink"/>
@@ -683,7 +683,7 @@
                 <w:noProof/>
                 <w:webHidden/>
               </w:rPr>
-              <w:instrText xml:space="preserve"> PAGEREF _Toc239974221 \h </w:instrText>
+              <w:instrText xml:space="preserve"> PAGEREF _Toc239977193 \h </w:instrText>
             </w:r>
             <w:r>
               <w:rPr>
@@ -727,7 +727,7 @@
               <w:szCs w:val="24"/>
             </w:rPr>
           </w:pPr>
-          <w:hyperlink w:anchor="_Toc239974222" w:history="1">
+          <w:hyperlink w:anchor="_Toc239977194" w:history="1">
             <w:r>
               <w:rPr>
                 <w:rStyle w:val="Hyperlink"/>
@@ -757,7 +757,7 @@
                 <w:noProof/>
                 <w:webHidden/>
               </w:rPr>
-              <w:instrText xml:space="preserve"> PAGEREF _Toc239974222 \h </w:instrText>
+              <w:instrText xml:space="preserve"> PAGEREF _Toc239977194 \h </w:instrText>
             </w:r>
             <w:r>
               <w:rPr>
@@ -801,7 +801,7 @@
               <w:szCs w:val="24"/>
             </w:rPr>
           </w:pPr>
-          <w:hyperlink w:anchor="_Toc239974223" w:history="1">
+          <w:hyperlink w:anchor="_Toc239977195" w:history="1">
             <w:r>
               <w:rPr>
                 <w:rStyle w:val="Hyperlink"/>
@@ -829,7 +829,7 @@
                 <w:noProof/>
                 <w:webHidden/>
               </w:rPr>
-              <w:instrText xml:space="preserve"> PAGEREF _Toc239974223 \h </w:instrText>
+              <w:instrText xml:space="preserve"> PAGEREF _Toc239977195 \h </w:instrText>
             </w:r>
             <w:r>
               <w:rPr>
@@ -873,7 +873,7 @@
               <w:szCs w:val="24"/>
             </w:rPr>
           </w:pPr>
-          <w:hyperlink w:anchor="_Toc239974224" w:history="1">
+          <w:hyperlink w:anchor="_Toc239977196" w:history="1">
             <w:r>
               <w:rPr>
                 <w:rStyle w:val="Hyperlink"/>
@@ -903,7 +903,7 @@
                 <w:noProof/>
                 <w:webHidden/>
               </w:rPr>
-              <w:instrText xml:space="preserve"> PAGEREF _Toc239974224 \h </w:instrText>
+              <w:instrText xml:space="preserve"> PAGEREF _Toc239977196 \h </w:instrText>
             </w:r>
             <w:r>
               <w:rPr>
@@ -947,7 +947,7 @@
               <w:szCs w:val="24"/>
             </w:rPr>
           </w:pPr>
-          <w:hyperlink w:anchor="_Toc239974225" w:history="1">
+          <w:hyperlink w:anchor="_Toc239977197" w:history="1">
             <w:r>
               <w:rPr>
                 <w:rStyle w:val="Hyperlink"/>
@@ -977,7 +977,7 @@
                 <w:noProof/>
                 <w:webHidden/>
               </w:rPr>
-              <w:instrText xml:space="preserve"> PAGEREF _Toc239974225 \h </w:instrText>
+              <w:instrText xml:space="preserve"> PAGEREF _Toc239977197 \h </w:instrText>
             </w:r>
             <w:r>
               <w:rPr>
@@ -1021,7 +1021,7 @@
               <w:szCs w:val="24"/>
             </w:rPr>
           </w:pPr>
-          <w:hyperlink w:anchor="_Toc239974226" w:history="1">
+          <w:hyperlink w:anchor="_Toc239977198" w:history="1">
             <w:r>
               <w:rPr>
                 <w:rStyle w:val="Hyperlink"/>
@@ -1051,7 +1051,7 @@
                 <w:noProof/>
                 <w:webHidden/>
               </w:rPr>
-              <w:instrText xml:space="preserve"> PAGEREF _Toc239974226 \h </w:instrText>
+              <w:instrText xml:space="preserve"> PAGEREF _Toc239977198 \h </w:instrText>
             </w:r>
             <w:r>
               <w:rPr>
@@ -1095,7 +1095,7 @@
               <w:szCs w:val="24"/>
             </w:rPr>
           </w:pPr>
-          <w:hyperlink w:anchor="_Toc239974227" w:history="1">
+          <w:hyperlink w:anchor="_Toc239977199" w:history="1">
             <w:r>
               <w:rPr>
                 <w:rStyle w:val="Hyperlink"/>
@@ -1125,7 +1125,7 @@
                 <w:noProof/>
                 <w:webHidden/>
               </w:rPr>
-              <w:instrText xml:space="preserve"> PAGEREF _Toc239974227 \h </w:instrText>
+              <w:instrText xml:space="preserve"> PAGEREF _Toc239977199 \h </w:instrText>
             </w:r>
             <w:r>
               <w:rPr>
@@ -1169,7 +1169,7 @@
               <w:szCs w:val="24"/>
             </w:rPr>
           </w:pPr>
-          <w:hyperlink w:anchor="_Toc239974228" w:history="1">
+          <w:hyperlink w:anchor="_Toc239977200" w:history="1">
             <w:r>
               <w:rPr>
                 <w:rStyle w:val="Hyperlink"/>
@@ -1199,7 +1199,79 @@
                 <w:noProof/>
                 <w:webHidden/>
               </w:rPr>
-              <w:instrText xml:space="preserve"> PAGEREF _Toc239974228 \h </w:instrText>
+              <w:instrText xml:space="preserve"> PAGEREF _Toc239977200 \h </w:instrText>
+            </w:r>
+            <w:r>
+              <w:rPr>
+                <w:noProof/>
+                <w:webHidden/>
+              </w:rPr>
+            </w:r>
+            <w:r>
+              <w:rPr>
+                <w:noProof/>
+                <w:webHidden/>
+              </w:rPr>
+              <w:fldChar w:fldCharType="separate"/>
+            </w:r>
+            <w:r>
+              <w:rPr>
+                <w:noProof/>
+                <w:webHidden/>
+              </w:rPr>
+              <w:t>9</w:t>
+            </w:r>
+            <w:r>
+              <w:rPr>
+                <w:noProof/>
+                <w:webHidden/>
+              </w:rPr>
+              <w:fldChar w:fldCharType="end"/>
+            </w:r>
+          </w:hyperlink>
+        </w:p>
+        <w:p>
+          <w:pPr>
+            <w:pStyle w:val="TOC1"/>
+            <w:tabs>
+              <w:tab w:val="right" w:leader="dot" w:pos="9016"/>
+            </w:tabs>
+            <w:rPr>
+              <w:rFonts w:asciiTheme="minorHAnsi" w:eastAsiaTheme="minorEastAsia" w:hAnsiTheme="minorHAnsi" w:cstheme="minorBidi"/>
+              <w:noProof/>
+              <w:sz w:val="24"/>
+              <w:szCs w:val="24"/>
+            </w:rPr>
+          </w:pPr>
+          <w:hyperlink w:anchor="_Toc239977201" w:history="1">
+            <w:r>
+              <w:rPr>
+                <w:rStyle w:val="Hyperlink"/>
+                <w:rFonts w:ascii="Geist" w:hAnsi="Geist"/>
+                <w:noProof/>
+              </w:rPr>
+              <w:t>Conclusion</w:t>
+            </w:r>
+            <w:r>
+              <w:rPr>
+                <w:noProof/>
+                <w:webHidden/>
+              </w:rPr>
+              <w:tab/>
+            </w:r>
+            <w:r>
+              <w:rPr>
+                <w:noProof/>
+                <w:webHidden/>
+              </w:rPr>
+              <w:fldChar w:fldCharType="begin"/>
+            </w:r>
+            <w:r>
+              <w:rPr>
+                <w:noProof/>
+                <w:webHidden/>
+              </w:rPr>
+              <w:instrText xml:space="preserve"> PAGEREF _Toc239977201 \h </w:instrText>
             </w:r>
             <w:r>
               <w:rPr>
@@ -1362,20 +1434,6 @@
     </w:p>
     <w:p>
       <w:pPr>
-        <w:rPr>
-          <w:rFonts w:ascii="Geist" w:hAnsi="Geist"/>
-        </w:rPr>
-      </w:pPr>
-    </w:p>
-    <w:p>
-      <w:pPr>
-        <w:rPr>
-          <w:rFonts w:ascii="Geist" w:hAnsi="Geist"/>
-        </w:rPr>
-      </w:pPr>
-    </w:p>
-    <w:p>
-      <w:pPr>
         <w:pStyle w:val="Heading1"/>
         <w:jc w:val="left"/>
         <w:rPr>
@@ -1383,6 +1441,7 @@
         </w:rPr>
       </w:pPr>
     </w:p>
+    <w:p/>
     <w:p>
       <w:pPr>
         <w:pStyle w:val="Heading1"/>
@@ -1391,7 +1450,7 @@
           <w:rFonts w:ascii="Geist" w:hAnsi="Geist"/>
         </w:rPr>
       </w:pPr>
-      <w:bookmarkStart w:id="0" w:name="_Toc239974219"/>
+      <w:bookmarkStart w:id="0" w:name="_Toc239977191"/>
       <w:r>
         <w:rPr>
           <w:rFonts w:ascii="Geist" w:hAnsi="Geist"/>
@@ -1420,7 +1479,7 @@
           <w:szCs w:val="24"/>
         </w:rPr>
       </w:pPr>
-      <w:bookmarkStart w:id="1" w:name="_Toc239974220"/>
+      <w:bookmarkStart w:id="1" w:name="_Toc239977192"/>
       <w:r>
         <w:rPr>
           <w:rFonts w:ascii="Geist" w:hAnsi="Geist"/>
@@ -1565,7 +1624,7 @@
           <w:noProof/>
         </w:rPr>
         <w:drawing>
-          <wp:inline distT="0" distB="0" distL="0" distR="0" wp14:anchorId="2A789878" wp14:editId="6FEAB103">
+          <wp:inline distT="0" distB="0" distL="0" distR="0" wp14:anchorId="2A789878" wp14:editId="1EE9C3C2">
             <wp:extent cx="5730225" cy="2475914"/>
             <wp:effectExtent l="0" t="0" r="4445" b="635"/>
             <wp:docPr id="1336606313" name="Picture 5"/>
@@ -1612,7 +1671,7 @@
           <w:noProof/>
         </w:rPr>
         <w:drawing>
-          <wp:inline distT="0" distB="0" distL="0" distR="0" wp14:anchorId="31204EBE" wp14:editId="4EFD8BD8">
+          <wp:inline distT="0" distB="0" distL="0" distR="0" wp14:anchorId="31204EBE" wp14:editId="78F30A94">
             <wp:extent cx="5729567" cy="2518117"/>
             <wp:effectExtent l="0" t="0" r="5080" b="0"/>
             <wp:docPr id="1822812998" name="Picture 3"/>
@@ -1659,7 +1718,7 @@
           <w:noProof/>
         </w:rPr>
         <w:drawing>
-          <wp:inline distT="0" distB="0" distL="0" distR="0" wp14:anchorId="2BA5FE0E" wp14:editId="6DAADD6D">
+          <wp:inline distT="0" distB="0" distL="0" distR="0" wp14:anchorId="2BA5FE0E" wp14:editId="1B85D96E">
             <wp:extent cx="5730757" cy="2440745"/>
             <wp:effectExtent l="0" t="0" r="3810" b="0"/>
             <wp:docPr id="872897550" name="Picture 4"/>
@@ -1712,7 +1771,7 @@
           <w:szCs w:val="24"/>
         </w:rPr>
       </w:pPr>
-      <w:bookmarkStart w:id="2" w:name="_Toc239974221"/>
+      <w:bookmarkStart w:id="2" w:name="_Toc239977193"/>
       <w:r>
         <w:rPr>
           <w:rFonts w:ascii="Geist" w:hAnsi="Geist"/>
@@ -1888,7 +1947,7 @@
           <w:noProof/>
         </w:rPr>
         <w:drawing>
-          <wp:inline distT="0" distB="0" distL="0" distR="0" wp14:anchorId="7BA10C47" wp14:editId="4F724416">
+          <wp:inline distT="0" distB="0" distL="0" distR="0" wp14:anchorId="7BA10C47" wp14:editId="6991DADA">
             <wp:extent cx="5731510" cy="2820670"/>
             <wp:effectExtent l="0" t="0" r="2540" b="0"/>
             <wp:docPr id="1917577199" name="Picture 11"/>
@@ -1990,7 +2049,7 @@
           <w:szCs w:val="28"/>
         </w:rPr>
       </w:pPr>
-      <w:bookmarkStart w:id="3" w:name="_Toc239974222"/>
+      <w:bookmarkStart w:id="3" w:name="_Toc239977194"/>
       <w:proofErr w:type="spellStart"/>
       <w:r>
         <w:rPr>
@@ -2794,7 +2853,7 @@
           <w:rFonts w:ascii="Geist" w:hAnsi="Geist"/>
         </w:rPr>
       </w:pPr>
-      <w:bookmarkStart w:id="4" w:name="_Toc239974223"/>
+      <w:bookmarkStart w:id="4" w:name="_Toc239977195"/>
       <w:r>
         <w:rPr>
           <w:rFonts w:ascii="Geist" w:hAnsi="Geist"/>
@@ -2813,7 +2872,7 @@
           <w:bCs/>
         </w:rPr>
       </w:pPr>
-      <w:bookmarkStart w:id="5" w:name="_Toc239974224"/>
+      <w:bookmarkStart w:id="5" w:name="_Toc239977196"/>
       <w:r>
         <w:rPr>
           <w:rFonts w:ascii="Geist" w:hAnsi="Geist"/>
@@ -2833,7 +2892,7 @@
           <w:bCs/>
         </w:rPr>
       </w:pPr>
-      <w:bookmarkStart w:id="6" w:name="_Toc239974225"/>
+      <w:bookmarkStart w:id="6" w:name="_Toc239977197"/>
       <w:r>
         <w:rPr>
           <w:rFonts w:ascii="Geist" w:hAnsi="Geist"/>
@@ -2925,7 +2984,7 @@
           <w:bCs/>
         </w:rPr>
       </w:pPr>
-      <w:bookmarkStart w:id="7" w:name="_Toc239974226"/>
+      <w:bookmarkStart w:id="7" w:name="_Toc239977198"/>
       <w:r>
         <w:rPr>
           <w:rFonts w:ascii="Geist" w:hAnsi="Geist"/>
@@ -4943,7 +5002,7 @@
           <w:bCs/>
         </w:rPr>
       </w:pPr>
-      <w:bookmarkStart w:id="8" w:name="_Toc239974227"/>
+      <w:bookmarkStart w:id="8" w:name="_Toc239977199"/>
       <w:r>
         <w:rPr>
           <w:rFonts w:ascii="Geist" w:hAnsi="Geist"/>
@@ -5905,7 +5964,7 @@
           <w:bCs/>
         </w:rPr>
       </w:pPr>
-      <w:bookmarkStart w:id="9" w:name="_Toc239974228"/>
+      <w:bookmarkStart w:id="9" w:name="_Toc239977200"/>
       <w:r>
         <w:rPr>
           <w:rFonts w:ascii="Geist" w:hAnsi="Geist"/>
@@ -5985,10 +6044,93 @@
       <w:pPr>
         <w:rPr>
           <w:rFonts w:ascii="Geist" w:hAnsi="Geist"/>
-          <w:sz w:val="24"/>
-          <w:szCs w:val="24"/>
-        </w:rPr>
-      </w:pPr>
+        </w:rPr>
+      </w:pPr>
+    </w:p>
+    <w:p>
+      <w:pPr>
+        <w:pStyle w:val="Heading1"/>
+        <w:jc w:val="left"/>
+        <w:rPr>
+          <w:rFonts w:ascii="Geist" w:hAnsi="Geist"/>
+        </w:rPr>
+      </w:pPr>
+      <w:bookmarkStart w:id="10" w:name="_Toc239977201"/>
+      <w:r>
+        <w:rPr>
+          <w:rFonts w:ascii="Geist" w:hAnsi="Geist"/>
+        </w:rPr>
+        <w:t>Conclusion</w:t>
+      </w:r>
+      <w:bookmarkEnd w:id="10"/>
+    </w:p>
+    <w:p>
+      <w:pPr>
+        <w:rPr>
+          <w:rFonts w:ascii="Geist" w:hAnsi="Geist"/>
+        </w:rPr>
+      </w:pPr>
+      <w:r>
+        <w:rPr>
+          <w:rFonts w:ascii="Geist" w:hAnsi="Geist"/>
+        </w:rPr>
+        <w:t>A complete test suite of 35 test cases (comprising Boundary Value Analysis and Equivalence Partitioning scenarios) was executed against the initially supplied </w:t>
+      </w:r>
+      <w:proofErr w:type="spellStart"/>
+      <w:r>
+        <w:rPr>
+          <w:rFonts w:ascii="Geist" w:hAnsi="Geist"/>
+        </w:rPr>
+        <w:t>CalcOverstayCharge</w:t>
+      </w:r>
+      <w:proofErr w:type="spellEnd"/>
+      <w:r>
+        <w:rPr>
+          <w:rFonts w:ascii="Geist" w:hAnsi="Geist"/>
+        </w:rPr>
+        <w:t xml:space="preserve"> implementation. During the baseline execution in Task 5, 29 test cases passed and 6 test cases failed, exposing 4 distinct root-cause defects logged as DF-01 through DF-06 (affecting test cases TC-11, TC-16, TC-20, TC-29, TC-34, and TC-35). </w:t>
+      </w:r>
+    </w:p>
+    <w:p>
+      <w:pPr>
+        <w:rPr>
+          <w:rFonts w:ascii="Geist" w:hAnsi="Geist"/>
+        </w:rPr>
+      </w:pPr>
+      <w:r>
+        <w:rPr>
+          <w:rFonts w:ascii="Geist" w:hAnsi="Geist"/>
+        </w:rPr>
+        <w:t>In Task 6, all 6 defects were remediated in source code by correcting the tier boundary conditions, implementing the missing upper limit constraint (</w:t>
+      </w:r>
+      <w:proofErr w:type="spellStart"/>
+      <w:r>
+        <w:rPr>
+          <w:rFonts w:ascii="Geist" w:hAnsi="Geist"/>
+        </w:rPr>
+        <w:t>hoursOverstayed</w:t>
+      </w:r>
+      <w:proofErr w:type="spellEnd"/>
+      <w:r>
+        <w:rPr>
+          <w:rFonts w:ascii="Geist" w:hAnsi="Geist"/>
+        </w:rPr>
+        <w:t xml:space="preserve"> &gt; 48), and placing permit validation prior to vehicle branching. Upon regression testing with the automated JUnit 5 test suite, all 35 test cases achieved 100% PASSED status, 100% line and branch coverage was verified via </w:t>
+      </w:r>
+      <w:proofErr w:type="spellStart"/>
+      <w:r>
+        <w:rPr>
+          <w:rFonts w:ascii="Geist" w:hAnsi="Geist"/>
+        </w:rPr>
+        <w:t>JaCoCo</w:t>
+      </w:r>
+      <w:proofErr w:type="spellEnd"/>
+      <w:r>
+        <w:rPr>
+          <w:rFonts w:ascii="Geist" w:hAnsi="Geist"/>
+        </w:rPr>
+        <w:t>, and all defect entries in the Defect Tracker were marked as Closed.</w:t>
+      </w:r>
     </w:p>
     <w:sectPr>
       <w:footerReference w:type="default" r:id="rId22"/>
@@ -7457,7 +7599,6 @@
   <w:style w:type="character" w:default="1" w:styleId="DefaultParagraphFont">
     <w:name w:val="Default Paragraph Font"/>
     <w:uiPriority w:val="1"/>
-    <w:semiHidden/>
     <w:unhideWhenUsed/>
   </w:style>
   <w:style w:type="table" w:default="1" w:styleId="TableNormal">

</xml_diff>